<commit_message>
POS shops connect their own Moniepoint and OPay accounts: no partnership needed
The action list now tests Moniepoint on a beta shop's own terminal, asks
OPay only for a developer contact if OPay shops join the pilot, and moves
a Moniepoint or OPay sales channel to optional, from March 2027. The
strategy says the same.

Co-Authored-By: Claude Opus 5.5 <noreply@anthropic.com>
Claude-Session: https://claude.ai/code/session_01UVUtQY4q9mhyTKD7Sxh3UY
</commit_message>
<xml_diff>
--- a/docs/roadmap/taskiem-coo-cmo-needs-people-actions.docx
+++ b/docs/roadmap/taskiem-coo-cmo-needs-people-actions.docx
@@ -1808,7 +1808,7 @@
           <w:sz w:val="20"/>
           <w:szCs w:val="20"/>
         </w:rPr>
-        <w:t xml:space="preserve"> meet the founder and the engineering lead. Read this list, the pilot roadmap and the strategy. Agree who in the company holds which outside relationship today (iSpend, Payrolla, Xenibase, Paystack, Termii, Moniepoint, OPay).</w:t>
+        <w:t xml:space="preserve"> meet the founder and the engineering lead. Read this list, the pilot roadmap and the strategy. Agree who in the company holds which outside relationship today (iSpend, Payrolla, Xenibase, Paystack, Termii).</w:t>
       </w:r>
     </w:p>
     <w:p>
@@ -2032,7 +2032,7 @@
           <w:sz w:val="20"/>
           <w:szCs w:val="20"/>
         </w:rPr>
-        <w:t xml:space="preserve"> start conversations with Moniepoint and OPay about POS terminal access (P15, P16).</w:t>
+        <w:t xml:space="preserve"> ask the beta businesses' owners who use a POS terminal whether they would let Taskiem test with their own Moniepoint account (P15, section 4).</w:t>
       </w:r>
     </w:p>
     <w:p>
@@ -8385,7 +8385,25 @@
                 <w:sz w:val="17"/>
                 <w:szCs w:val="17"/>
               </w:rPr>
-              <w:t xml:space="preserve">Moniepoint POS: a Moniepoint Business account with a terminal (app 1.11.0 or later), a sandbox API client, and the webhook pointed at staging; and answers to the ten questions in the integration guide (docs/integrations/moniepoint_pos.md)</w:t>
+              <w:t xml:space="preserve">Test the Moniepoint POS connection on a real terminal, using a beta shop's </w:t>
+            </w:r>
+            <w:r>
+              <w:rPr>
+                <w:rFonts w:ascii="Plus Jakarta Sans Bold" w:cs="Plus Jakarta Sans Bold" w:eastAsia="Plus Jakarta Sans Bold" w:hAnsi="Plus Jakarta Sans Bold"/>
+                <w:color w:val="1F2A26"/>
+                <w:sz w:val="17"/>
+                <w:szCs w:val="17"/>
+              </w:rPr>
+              <w:t xml:space="preserve">own</w:t>
+            </w:r>
+            <w:r>
+              <w:rPr>
+                <w:rFonts w:ascii="Plus Jakarta Sans" w:cs="Plus Jakarta Sans" w:eastAsia="Plus Jakarta Sans" w:hAnsi="Plus Jakarta Sans"/>
+                <w:color w:val="1F2A26"/>
+                <w:sz w:val="17"/>
+                <w:szCs w:val="17"/>
+              </w:rPr>
+              <w:t xml:space="preserve"> Moniepoint Business account, with the owner's written agreement. The owner switches on ERP integration in their dashboard, creates the API key and points the notifications at Taskiem, with an engineer present. Taskiem needs no contract with Moniepoint for this: the shop is Moniepoint's merchant and gives Taskiem access itself. Engineering then settles the ten questions in docs/integrations/moniepoint_pos.md from real sales</w:t>
             </w:r>
           </w:p>
         </w:tc>
@@ -8418,7 +8436,7 @@
                 <w:sz w:val="17"/>
                 <w:szCs w:val="17"/>
               </w:rPr>
-              <w:t xml:space="preserve">Engineering lead</w:t>
+              <w:t xml:space="preserve">Engineering lead, a beta shop</w:t>
             </w:r>
           </w:p>
         </w:tc>
@@ -8451,7 +8469,7 @@
                 <w:sz w:val="17"/>
                 <w:szCs w:val="17"/>
               </w:rPr>
-              <w:t xml:space="preserve">Account and sandbox ready; questions answered</w:t>
+              <w:t xml:space="preserve">A week of real terminal sales recorded correctly</w:t>
             </w:r>
           </w:p>
         </w:tc>
@@ -8484,7 +8502,7 @@
                 <w:sz w:val="17"/>
                 <w:szCs w:val="17"/>
               </w:rPr>
-              <w:t xml:space="preserve">30 Nov</w:t>
+              <w:t xml:space="preserve">Only if a beta shop uses Moniepoint; by 18 Dec</w:t>
             </w:r>
           </w:p>
         </w:tc>
@@ -8555,7 +8573,7 @@
                 <w:sz w:val="17"/>
                 <w:szCs w:val="17"/>
               </w:rPr>
-              <w:t xml:space="preserve">OPay Business: one conversation with an OPay sales representative to get a test business with a POS terminal and its keys, the offline APIs switched on, written answers to the questions in the guide, and OPay's payout API documentation</w:t>
+              <w:t xml:space="preserve">OPay: unlike Moniepoint, OPay switches on these connections per business through its sales representative, so a shop cannot do it alone. Only if the pilot has OPay shops: find one developer-support contact at OPay to (a) answer the questions in docs/integrations/opay_business.md, above all whether a walk-up card payment on a terminal is reported at all, and (b) say how a shop asks for the connection. Not a partnership</w:t>
             </w:r>
           </w:p>
         </w:tc>
@@ -8621,7 +8639,7 @@
                 <w:sz w:val="17"/>
                 <w:szCs w:val="17"/>
               </w:rPr>
-              <w:t xml:space="preserve">Test business ready; documents received</w:t>
+              <w:t xml:space="preserve">Questions answered in writing; the shop's steps known</w:t>
             </w:r>
           </w:p>
         </w:tc>
@@ -8654,7 +8672,7 @@
                 <w:sz w:val="17"/>
                 <w:szCs w:val="17"/>
               </w:rPr>
-              <w:t xml:space="preserve">30 Nov</w:t>
+              <w:t xml:space="preserve">Only if needed; by 18 Dec</w:t>
             </w:r>
           </w:p>
         </w:tc>
@@ -12348,6 +12366,110 @@
                 <w:sz w:val="17"/>
                 <w:szCs w:val="17"/>
               </w:rPr>
+              <w:t xml:space="preserve">(strategy)</w:t>
+            </w:r>
+          </w:p>
+        </w:tc>
+        <w:tc>
+          <w:tcPr>
+            <w:tcW w:type="dxa" w:w="5354"/>
+            <w:tcBorders>
+              <w:top w:val="single" w:color="D5DDD6" w:sz="4"/>
+              <w:left w:val="single" w:color="D5DDD6" w:sz="4"/>
+              <w:bottom w:val="single" w:color="D5DDD6" w:sz="4"/>
+              <w:right w:val="single" w:color="D5DDD6" w:sz="4"/>
+            </w:tcBorders>
+            <w:shd w:fill="F1F4EF" w:color="auto" w:val="clear"/>
+            <w:tcMar>
+              <w:top w:type="dxa" w:w="60"/>
+              <w:left w:type="dxa" w:w="100"/>
+              <w:bottom w:type="dxa" w:w="60"/>
+              <w:right w:type="dxa" w:w="100"/>
+            </w:tcMar>
+            <w:vAlign w:val="top"/>
+          </w:tcPr>
+          <w:p>
+            <w:pPr>
+              <w:spacing w:after="20" w:line="252"/>
+            </w:pPr>
+            <w:r>
+              <w:rPr>
+                <w:rFonts w:ascii="Plus Jakarta Sans" w:cs="Plus Jakarta Sans" w:eastAsia="Plus Jakarta Sans" w:hAnsi="Plus Jakarta Sans"/>
+                <w:color w:val="1F2A26"/>
+                <w:sz w:val="17"/>
+                <w:szCs w:val="17"/>
+              </w:rPr>
+              <w:t xml:space="preserve">Moniepoint and OPay as a sales channel: offering Taskiem to their merchants through them (referral or co-marketing). Optional, never a requirement: their merchants can connect themselves</w:t>
+            </w:r>
+          </w:p>
+        </w:tc>
+        <w:tc>
+          <w:tcPr>
+            <w:tcW w:type="dxa" w:w="2785"/>
+            <w:tcBorders>
+              <w:top w:val="single" w:color="D5DDD6" w:sz="4"/>
+              <w:left w:val="single" w:color="D5DDD6" w:sz="4"/>
+              <w:bottom w:val="single" w:color="D5DDD6" w:sz="4"/>
+              <w:right w:val="single" w:color="D5DDD6" w:sz="4"/>
+            </w:tcBorders>
+            <w:shd w:fill="F1F4EF" w:color="auto" w:val="clear"/>
+            <w:tcMar>
+              <w:top w:type="dxa" w:w="60"/>
+              <w:left w:type="dxa" w:w="100"/>
+              <w:bottom w:type="dxa" w:w="60"/>
+              <w:right w:type="dxa" w:w="100"/>
+            </w:tcMar>
+            <w:vAlign w:val="top"/>
+          </w:tcPr>
+          <w:p>
+            <w:pPr>
+              <w:spacing w:after="20" w:line="252"/>
+            </w:pPr>
+            <w:r>
+              <w:rPr>
+                <w:rFonts w:ascii="Plus Jakarta Sans" w:cs="Plus Jakarta Sans" w:eastAsia="Plus Jakarta Sans" w:hAnsi="Plus Jakarta Sans"/>
+                <w:color w:val="1F2A26"/>
+                <w:sz w:val="17"/>
+                <w:szCs w:val="17"/>
+              </w:rPr>
+              <w:t xml:space="preserve">From March 2027, with the pilot's results</w:t>
+            </w:r>
+          </w:p>
+        </w:tc>
+      </w:tr>
+      <w:tr>
+        <w:trPr>
+          <w:cantSplit/>
+        </w:trPr>
+        <w:tc>
+          <w:tcPr>
+            <w:tcW w:type="dxa" w:w="1499"/>
+            <w:tcBorders>
+              <w:top w:val="single" w:color="D5DDD6" w:sz="4"/>
+              <w:left w:val="single" w:color="D5DDD6" w:sz="4"/>
+              <w:bottom w:val="single" w:color="D5DDD6" w:sz="4"/>
+              <w:right w:val="single" w:color="D5DDD6" w:sz="4"/>
+            </w:tcBorders>
+            <w:shd w:fill="FFFFFF" w:color="auto" w:val="clear"/>
+            <w:tcMar>
+              <w:top w:type="dxa" w:w="60"/>
+              <w:left w:type="dxa" w:w="100"/>
+              <w:bottom w:type="dxa" w:w="60"/>
+              <w:right w:type="dxa" w:w="100"/>
+            </w:tcMar>
+            <w:vAlign w:val="top"/>
+          </w:tcPr>
+          <w:p>
+            <w:pPr>
+              <w:spacing w:after="20" w:line="252"/>
+            </w:pPr>
+            <w:r>
+              <w:rPr>
+                <w:rFonts w:ascii="Plus Jakarta Sans" w:cs="Plus Jakarta Sans" w:eastAsia="Plus Jakarta Sans" w:hAnsi="Plus Jakarta Sans"/>
+                <w:color w:val="1F2A26"/>
+                <w:sz w:val="17"/>
+                <w:szCs w:val="17"/>
+              </w:rPr>
               <w:t xml:space="preserve">P4-K5, P4-C6, CS3</w:t>
             </w:r>
           </w:p>
@@ -12361,7 +12483,7 @@
               <w:bottom w:val="single" w:color="D5DDD6" w:sz="4"/>
               <w:right w:val="single" w:color="D5DDD6" w:sz="4"/>
             </w:tcBorders>
-            <w:shd w:fill="F1F4EF" w:color="auto" w:val="clear"/>
+            <w:shd w:fill="FFFFFF" w:color="auto" w:val="clear"/>
             <w:tcMar>
               <w:top w:type="dxa" w:w="60"/>
               <w:left w:type="dxa" w:w="100"/>
@@ -12394,7 +12516,7 @@
               <w:bottom w:val="single" w:color="D5DDD6" w:sz="4"/>
               <w:right w:val="single" w:color="D5DDD6" w:sz="4"/>
             </w:tcBorders>
-            <w:shd w:fill="F1F4EF" w:color="auto" w:val="clear"/>
+            <w:shd w:fill="FFFFFF" w:color="auto" w:val="clear"/>
             <w:tcMar>
               <w:top w:type="dxa" w:w="60"/>
               <w:left w:type="dxa" w:w="100"/>
@@ -16954,388 +17076,6 @@
                 <w:szCs w:val="15"/>
               </w:rPr>
               <w:t xml:space="preserve">Product domains</w:t>
-            </w:r>
-          </w:p>
-        </w:tc>
-        <w:tc>
-          <w:tcPr>
-            <w:tcW w:type="dxa" w:w="963"/>
-            <w:tcBorders>
-              <w:top w:val="single" w:color="D5DDD6" w:sz="4"/>
-              <w:left w:val="single" w:color="D5DDD6" w:sz="4"/>
-              <w:bottom w:val="single" w:color="D5DDD6" w:sz="4"/>
-              <w:right w:val="single" w:color="D5DDD6" w:sz="4"/>
-            </w:tcBorders>
-            <w:shd w:fill="FFFFFF" w:color="auto" w:val="clear"/>
-            <w:tcMar>
-              <w:top w:type="dxa" w:w="60"/>
-              <w:left w:type="dxa" w:w="100"/>
-              <w:bottom w:type="dxa" w:w="60"/>
-              <w:right w:type="dxa" w:w="100"/>
-            </w:tcMar>
-            <w:vAlign w:val="top"/>
-          </w:tcPr>
-          <w:p>
-            <w:pPr>
-              <w:spacing w:after="20" w:line="252"/>
-            </w:pPr>
-          </w:p>
-        </w:tc>
-        <w:tc>
-          <w:tcPr>
-            <w:tcW w:type="dxa" w:w="1392"/>
-            <w:tcBorders>
-              <w:top w:val="single" w:color="D5DDD6" w:sz="4"/>
-              <w:left w:val="single" w:color="D5DDD6" w:sz="4"/>
-              <w:bottom w:val="single" w:color="D5DDD6" w:sz="4"/>
-              <w:right w:val="single" w:color="D5DDD6" w:sz="4"/>
-            </w:tcBorders>
-            <w:shd w:fill="FFFFFF" w:color="auto" w:val="clear"/>
-            <w:tcMar>
-              <w:top w:type="dxa" w:w="60"/>
-              <w:left w:type="dxa" w:w="100"/>
-              <w:bottom w:type="dxa" w:w="60"/>
-              <w:right w:type="dxa" w:w="100"/>
-            </w:tcMar>
-            <w:vAlign w:val="top"/>
-          </w:tcPr>
-          <w:p>
-            <w:pPr>
-              <w:spacing w:after="20" w:line="252"/>
-            </w:pPr>
-          </w:p>
-        </w:tc>
-        <w:tc>
-          <w:tcPr>
-            <w:tcW w:type="dxa" w:w="859"/>
-            <w:tcBorders>
-              <w:top w:val="single" w:color="D5DDD6" w:sz="4"/>
-              <w:left w:val="single" w:color="D5DDD6" w:sz="4"/>
-              <w:bottom w:val="single" w:color="D5DDD6" w:sz="4"/>
-              <w:right w:val="single" w:color="D5DDD6" w:sz="4"/>
-            </w:tcBorders>
-            <w:shd w:fill="FFFFFF" w:color="auto" w:val="clear"/>
-            <w:tcMar>
-              <w:top w:type="dxa" w:w="60"/>
-              <w:left w:type="dxa" w:w="100"/>
-              <w:bottom w:type="dxa" w:w="60"/>
-              <w:right w:type="dxa" w:w="100"/>
-            </w:tcMar>
-            <w:vAlign w:val="top"/>
-          </w:tcPr>
-          <w:p>
-            <w:pPr>
-              <w:spacing w:after="20" w:line="252"/>
-            </w:pPr>
-          </w:p>
-        </w:tc>
-      </w:tr>
-      <w:tr>
-        <w:trPr>
-          <w:cantSplit/>
-        </w:trPr>
-        <w:tc>
-          <w:tcPr>
-            <w:tcW w:type="dxa" w:w="1820"/>
-            <w:tcBorders>
-              <w:top w:val="single" w:color="D5DDD6" w:sz="4"/>
-              <w:left w:val="single" w:color="D5DDD6" w:sz="4"/>
-              <w:bottom w:val="single" w:color="D5DDD6" w:sz="4"/>
-              <w:right w:val="single" w:color="D5DDD6" w:sz="4"/>
-            </w:tcBorders>
-            <w:shd w:fill="F1F4EF" w:color="auto" w:val="clear"/>
-            <w:tcMar>
-              <w:top w:type="dxa" w:w="60"/>
-              <w:left w:type="dxa" w:w="100"/>
-              <w:bottom w:type="dxa" w:w="60"/>
-              <w:right w:type="dxa" w:w="100"/>
-            </w:tcMar>
-            <w:vAlign w:val="top"/>
-          </w:tcPr>
-          <w:p>
-            <w:pPr>
-              <w:spacing w:after="20" w:line="252"/>
-            </w:pPr>
-            <w:r>
-              <w:rPr>
-                <w:rFonts w:ascii="Plus Jakarta Sans" w:cs="Plus Jakarta Sans" w:eastAsia="Plus Jakarta Sans" w:hAnsi="Plus Jakarta Sans"/>
-                <w:color w:val="1F2A26"/>
-                <w:sz w:val="15"/>
-                <w:szCs w:val="15"/>
-              </w:rPr>
-              <w:t xml:space="preserve">Moniepoint Business</w:t>
-            </w:r>
-          </w:p>
-        </w:tc>
-        <w:tc>
-          <w:tcPr>
-            <w:tcW w:type="dxa" w:w="1392"/>
-            <w:tcBorders>
-              <w:top w:val="single" w:color="D5DDD6" w:sz="4"/>
-              <w:left w:val="single" w:color="D5DDD6" w:sz="4"/>
-              <w:bottom w:val="single" w:color="D5DDD6" w:sz="4"/>
-              <w:right w:val="single" w:color="D5DDD6" w:sz="4"/>
-            </w:tcBorders>
-            <w:shd w:fill="F1F4EF" w:color="auto" w:val="clear"/>
-            <w:tcMar>
-              <w:top w:type="dxa" w:w="60"/>
-              <w:left w:type="dxa" w:w="100"/>
-              <w:bottom w:type="dxa" w:w="60"/>
-              <w:right w:type="dxa" w:w="100"/>
-            </w:tcMar>
-            <w:vAlign w:val="top"/>
-          </w:tcPr>
-          <w:p>
-            <w:pPr>
-              <w:spacing w:after="20" w:line="252"/>
-            </w:pPr>
-          </w:p>
-        </w:tc>
-        <w:tc>
-          <w:tcPr>
-            <w:tcW w:type="dxa" w:w="1713"/>
-            <w:tcBorders>
-              <w:top w:val="single" w:color="D5DDD6" w:sz="4"/>
-              <w:left w:val="single" w:color="D5DDD6" w:sz="4"/>
-              <w:bottom w:val="single" w:color="D5DDD6" w:sz="4"/>
-              <w:right w:val="single" w:color="D5DDD6" w:sz="4"/>
-            </w:tcBorders>
-            <w:shd w:fill="F1F4EF" w:color="auto" w:val="clear"/>
-            <w:tcMar>
-              <w:top w:type="dxa" w:w="60"/>
-              <w:left w:type="dxa" w:w="100"/>
-              <w:bottom w:type="dxa" w:w="60"/>
-              <w:right w:type="dxa" w:w="100"/>
-            </w:tcMar>
-            <w:vAlign w:val="top"/>
-          </w:tcPr>
-          <w:p>
-            <w:pPr>
-              <w:spacing w:after="20" w:line="252"/>
-            </w:pPr>
-          </w:p>
-        </w:tc>
-        <w:tc>
-          <w:tcPr>
-            <w:tcW w:type="dxa" w:w="1499"/>
-            <w:tcBorders>
-              <w:top w:val="single" w:color="D5DDD6" w:sz="4"/>
-              <w:left w:val="single" w:color="D5DDD6" w:sz="4"/>
-              <w:bottom w:val="single" w:color="D5DDD6" w:sz="4"/>
-              <w:right w:val="single" w:color="D5DDD6" w:sz="4"/>
-            </w:tcBorders>
-            <w:shd w:fill="F1F4EF" w:color="auto" w:val="clear"/>
-            <w:tcMar>
-              <w:top w:type="dxa" w:w="60"/>
-              <w:left w:type="dxa" w:w="100"/>
-              <w:bottom w:type="dxa" w:w="60"/>
-              <w:right w:type="dxa" w:w="100"/>
-            </w:tcMar>
-            <w:vAlign w:val="top"/>
-          </w:tcPr>
-          <w:p>
-            <w:pPr>
-              <w:spacing w:after="20" w:line="252"/>
-            </w:pPr>
-            <w:r>
-              <w:rPr>
-                <w:rFonts w:ascii="Plus Jakarta Sans" w:cs="Plus Jakarta Sans" w:eastAsia="Plus Jakarta Sans" w:hAnsi="Plus Jakarta Sans"/>
-                <w:color w:val="1F2A26"/>
-                <w:sz w:val="15"/>
-                <w:szCs w:val="15"/>
-              </w:rPr>
-              <w:t xml:space="preserve">POS testing</w:t>
-            </w:r>
-          </w:p>
-        </w:tc>
-        <w:tc>
-          <w:tcPr>
-            <w:tcW w:type="dxa" w:w="963"/>
-            <w:tcBorders>
-              <w:top w:val="single" w:color="D5DDD6" w:sz="4"/>
-              <w:left w:val="single" w:color="D5DDD6" w:sz="4"/>
-              <w:bottom w:val="single" w:color="D5DDD6" w:sz="4"/>
-              <w:right w:val="single" w:color="D5DDD6" w:sz="4"/>
-            </w:tcBorders>
-            <w:shd w:fill="F1F4EF" w:color="auto" w:val="clear"/>
-            <w:tcMar>
-              <w:top w:type="dxa" w:w="60"/>
-              <w:left w:type="dxa" w:w="100"/>
-              <w:bottom w:type="dxa" w:w="60"/>
-              <w:right w:type="dxa" w:w="100"/>
-            </w:tcMar>
-            <w:vAlign w:val="top"/>
-          </w:tcPr>
-          <w:p>
-            <w:pPr>
-              <w:spacing w:after="20" w:line="252"/>
-            </w:pPr>
-          </w:p>
-        </w:tc>
-        <w:tc>
-          <w:tcPr>
-            <w:tcW w:type="dxa" w:w="1392"/>
-            <w:tcBorders>
-              <w:top w:val="single" w:color="D5DDD6" w:sz="4"/>
-              <w:left w:val="single" w:color="D5DDD6" w:sz="4"/>
-              <w:bottom w:val="single" w:color="D5DDD6" w:sz="4"/>
-              <w:right w:val="single" w:color="D5DDD6" w:sz="4"/>
-            </w:tcBorders>
-            <w:shd w:fill="F1F4EF" w:color="auto" w:val="clear"/>
-            <w:tcMar>
-              <w:top w:type="dxa" w:w="60"/>
-              <w:left w:type="dxa" w:w="100"/>
-              <w:bottom w:type="dxa" w:w="60"/>
-              <w:right w:type="dxa" w:w="100"/>
-            </w:tcMar>
-            <w:vAlign w:val="top"/>
-          </w:tcPr>
-          <w:p>
-            <w:pPr>
-              <w:spacing w:after="20" w:line="252"/>
-            </w:pPr>
-          </w:p>
-        </w:tc>
-        <w:tc>
-          <w:tcPr>
-            <w:tcW w:type="dxa" w:w="859"/>
-            <w:tcBorders>
-              <w:top w:val="single" w:color="D5DDD6" w:sz="4"/>
-              <w:left w:val="single" w:color="D5DDD6" w:sz="4"/>
-              <w:bottom w:val="single" w:color="D5DDD6" w:sz="4"/>
-              <w:right w:val="single" w:color="D5DDD6" w:sz="4"/>
-            </w:tcBorders>
-            <w:shd w:fill="F1F4EF" w:color="auto" w:val="clear"/>
-            <w:tcMar>
-              <w:top w:type="dxa" w:w="60"/>
-              <w:left w:type="dxa" w:w="100"/>
-              <w:bottom w:type="dxa" w:w="60"/>
-              <w:right w:type="dxa" w:w="100"/>
-            </w:tcMar>
-            <w:vAlign w:val="top"/>
-          </w:tcPr>
-          <w:p>
-            <w:pPr>
-              <w:spacing w:after="20" w:line="252"/>
-            </w:pPr>
-          </w:p>
-        </w:tc>
-      </w:tr>
-      <w:tr>
-        <w:trPr>
-          <w:cantSplit/>
-        </w:trPr>
-        <w:tc>
-          <w:tcPr>
-            <w:tcW w:type="dxa" w:w="1820"/>
-            <w:tcBorders>
-              <w:top w:val="single" w:color="D5DDD6" w:sz="4"/>
-              <w:left w:val="single" w:color="D5DDD6" w:sz="4"/>
-              <w:bottom w:val="single" w:color="D5DDD6" w:sz="4"/>
-              <w:right w:val="single" w:color="D5DDD6" w:sz="4"/>
-            </w:tcBorders>
-            <w:shd w:fill="FFFFFF" w:color="auto" w:val="clear"/>
-            <w:tcMar>
-              <w:top w:type="dxa" w:w="60"/>
-              <w:left w:type="dxa" w:w="100"/>
-              <w:bottom w:type="dxa" w:w="60"/>
-              <w:right w:type="dxa" w:w="100"/>
-            </w:tcMar>
-            <w:vAlign w:val="top"/>
-          </w:tcPr>
-          <w:p>
-            <w:pPr>
-              <w:spacing w:after="20" w:line="252"/>
-            </w:pPr>
-            <w:r>
-              <w:rPr>
-                <w:rFonts w:ascii="Plus Jakarta Sans" w:cs="Plus Jakarta Sans" w:eastAsia="Plus Jakarta Sans" w:hAnsi="Plus Jakarta Sans"/>
-                <w:color w:val="1F2A26"/>
-                <w:sz w:val="15"/>
-                <w:szCs w:val="15"/>
-              </w:rPr>
-              <w:t xml:space="preserve">OPay Business</w:t>
-            </w:r>
-          </w:p>
-        </w:tc>
-        <w:tc>
-          <w:tcPr>
-            <w:tcW w:type="dxa" w:w="1392"/>
-            <w:tcBorders>
-              <w:top w:val="single" w:color="D5DDD6" w:sz="4"/>
-              <w:left w:val="single" w:color="D5DDD6" w:sz="4"/>
-              <w:bottom w:val="single" w:color="D5DDD6" w:sz="4"/>
-              <w:right w:val="single" w:color="D5DDD6" w:sz="4"/>
-            </w:tcBorders>
-            <w:shd w:fill="FFFFFF" w:color="auto" w:val="clear"/>
-            <w:tcMar>
-              <w:top w:type="dxa" w:w="60"/>
-              <w:left w:type="dxa" w:w="100"/>
-              <w:bottom w:type="dxa" w:w="60"/>
-              <w:right w:type="dxa" w:w="100"/>
-            </w:tcMar>
-            <w:vAlign w:val="top"/>
-          </w:tcPr>
-          <w:p>
-            <w:pPr>
-              <w:spacing w:after="20" w:line="252"/>
-            </w:pPr>
-          </w:p>
-        </w:tc>
-        <w:tc>
-          <w:tcPr>
-            <w:tcW w:type="dxa" w:w="1713"/>
-            <w:tcBorders>
-              <w:top w:val="single" w:color="D5DDD6" w:sz="4"/>
-              <w:left w:val="single" w:color="D5DDD6" w:sz="4"/>
-              <w:bottom w:val="single" w:color="D5DDD6" w:sz="4"/>
-              <w:right w:val="single" w:color="D5DDD6" w:sz="4"/>
-            </w:tcBorders>
-            <w:shd w:fill="FFFFFF" w:color="auto" w:val="clear"/>
-            <w:tcMar>
-              <w:top w:type="dxa" w:w="60"/>
-              <w:left w:type="dxa" w:w="100"/>
-              <w:bottom w:type="dxa" w:w="60"/>
-              <w:right w:type="dxa" w:w="100"/>
-            </w:tcMar>
-            <w:vAlign w:val="top"/>
-          </w:tcPr>
-          <w:p>
-            <w:pPr>
-              <w:spacing w:after="20" w:line="252"/>
-            </w:pPr>
-          </w:p>
-        </w:tc>
-        <w:tc>
-          <w:tcPr>
-            <w:tcW w:type="dxa" w:w="1499"/>
-            <w:tcBorders>
-              <w:top w:val="single" w:color="D5DDD6" w:sz="4"/>
-              <w:left w:val="single" w:color="D5DDD6" w:sz="4"/>
-              <w:bottom w:val="single" w:color="D5DDD6" w:sz="4"/>
-              <w:right w:val="single" w:color="D5DDD6" w:sz="4"/>
-            </w:tcBorders>
-            <w:shd w:fill="FFFFFF" w:color="auto" w:val="clear"/>
-            <w:tcMar>
-              <w:top w:type="dxa" w:w="60"/>
-              <w:left w:type="dxa" w:w="100"/>
-              <w:bottom w:type="dxa" w:w="60"/>
-              <w:right w:type="dxa" w:w="100"/>
-            </w:tcMar>
-            <w:vAlign w:val="top"/>
-          </w:tcPr>
-          <w:p>
-            <w:pPr>
-              <w:spacing w:after="20" w:line="252"/>
-            </w:pPr>
-            <w:r>
-              <w:rPr>
-                <w:rFonts w:ascii="Plus Jakarta Sans" w:cs="Plus Jakarta Sans" w:eastAsia="Plus Jakarta Sans" w:hAnsi="Plus Jakarta Sans"/>
-                <w:color w:val="1F2A26"/>
-                <w:sz w:val="15"/>
-                <w:szCs w:val="15"/>
-              </w:rPr>
-              <w:t xml:space="preserve">POS testing</w:t>
             </w:r>
           </w:p>
         </w:tc>

</xml_diff>

<commit_message>
WhatsApp own numbers: apply as a Meta Tech Provider (W3 decided)
Each business pays Meta directly for its own number's messages; Taskiem
does not become or partner with a Business Solution Provider for now,
and bills shared-number overage at cost. Recorded in the register, the
Phase 3 status, the WhatsApp page and the COO and CMO's action list.

Co-Authored-By: Claude Opus 5.5 <noreply@anthropic.com>
Claude-Session: https://claude.ai/code/session_01UVUtQY4q9mhyTKD7Sxh3UY
</commit_message>
<xml_diff>
--- a/docs/roadmap/taskiem-coo-cmo-needs-people-actions.docx
+++ b/docs/roadmap/taskiem-coo-cmo-needs-people-actions.docx
@@ -9606,7 +9606,7 @@
                 <w:sz w:val="17"/>
                 <w:szCs w:val="17"/>
               </w:rPr>
-              <w:t xml:space="preserve">NT4</w:t>
+              <w:t xml:space="preserve">NT4, W3</w:t>
             </w:r>
           </w:p>
         </w:tc>
@@ -9639,7 +9639,34 @@
                 <w:sz w:val="17"/>
                 <w:szCs w:val="17"/>
               </w:rPr>
-              <w:t xml:space="preserve">Meta Tech Provider approval, so businesses can connect their own WhatsApp number in one click</w:t>
+              <w:t xml:space="preserve">Apply for Meta Tech Provider approval, so a business can connect its own WhatsApp number with one button (Meta's Embedded Signup). Decided 27 October 2026 (W3): Taskiem applies as a </w:t>
+            </w:r>
+            <w:r>
+              <w:rPr>
+                <w:rFonts w:ascii="Plus Jakarta Sans Bold" w:cs="Plus Jakarta Sans Bold" w:eastAsia="Plus Jakarta Sans Bold" w:hAnsi="Plus Jakarta Sans Bold"/>
+                <w:color w:val="1F2A26"/>
+                <w:sz w:val="17"/>
+                <w:szCs w:val="17"/>
+              </w:rPr>
+              <w:t xml:space="preserve">Tech Provider</w:t>
+            </w:r>
+            <w:r>
+              <w:rPr>
+                <w:rFonts w:ascii="Plus Jakarta Sans" w:cs="Plus Jakarta Sans" w:eastAsia="Plus Jakarta Sans" w:hAnsi="Plus Jakarta Sans"/>
+                <w:color w:val="1F2A26"/>
+                <w:sz w:val="17"/>
+                <w:szCs w:val="17"/>
+              </w:rPr>
+              <w:t xml:space="preserve">, so each business pays Meta directly for messages from its own number; it does not become a Business Solution Provider (Solution Partner) or partner with one for now. Revisit when a few hundred businesses ask for their own number. Messages from the shared number beyond a plan's allowance are charged to the business </w:t>
+            </w:r>
+            <w:r>
+              <w:rPr>
+                <w:rFonts w:ascii="Plus Jakarta Sans Bold" w:cs="Plus Jakarta Sans Bold" w:eastAsia="Plus Jakarta Sans Bold" w:hAnsi="Plus Jakarta Sans Bold"/>
+                <w:color w:val="1F2A26"/>
+                <w:sz w:val="17"/>
+                <w:szCs w:val="17"/>
+              </w:rPr>
+              <w:t xml:space="preserve">at cost</w:t>
             </w:r>
           </w:p>
         </w:tc>
@@ -9672,7 +9699,7 @@
                 <w:sz w:val="17"/>
                 <w:szCs w:val="17"/>
               </w:rPr>
-              <w:t xml:space="preserve">Engineering lead</w:t>
+              <w:t xml:space="preserve">Engineering lead (app review and the screencast Meta asks for)</w:t>
             </w:r>
           </w:p>
         </w:tc>
@@ -9705,7 +9732,7 @@
                 <w:sz w:val="17"/>
                 <w:szCs w:val="17"/>
               </w:rPr>
-              <w:t xml:space="preserve">Approved</w:t>
+              <w:t xml:space="preserve">Approved; the one-button set-up switched on</w:t>
             </w:r>
           </w:p>
         </w:tc>
@@ -9738,7 +9765,7 @@
                 <w:sz w:val="17"/>
                 <w:szCs w:val="17"/>
               </w:rPr>
-              <w:t xml:space="preserve">Apply by 15 Dec</w:t>
+              <w:t xml:space="preserve">Apply once W1 is done; by 15 Dec</w:t>
             </w:r>
           </w:p>
         </w:tc>
@@ -9776,7 +9803,7 @@
                 <w:sz w:val="17"/>
                 <w:szCs w:val="17"/>
               </w:rPr>
-              <w:t xml:space="preserve">W3</w:t>
+              <w:t xml:space="preserve">NT2</w:t>
             </w:r>
           </w:p>
         </w:tc>
@@ -9809,7 +9836,7 @@
                 <w:sz w:val="17"/>
                 <w:szCs w:val="17"/>
               </w:rPr>
-              <w:t xml:space="preserve">Recommend to the founder: should Taskiem become a Meta Business Solution Provider, or partner with one, for businesses' own WhatsApp numbers; and what to charge above the plan's message allowance</w:t>
+              <w:t xml:space="preserve">Owner sessions on own domains: two or three owners who own a domain connect it to their page with only the in-app guide; note where each stops</w:t>
             </w:r>
           </w:p>
         </w:tc>
@@ -9842,7 +9869,7 @@
                 <w:sz w:val="17"/>
                 <w:szCs w:val="17"/>
               </w:rPr>
-              <w:t xml:space="preserve">Founder</w:t>
+              <w:t xml:space="preserve">Product lead, beta businesses</w:t>
             </w:r>
           </w:p>
         </w:tc>
@@ -9875,7 +9902,7 @@
                 <w:sz w:val="17"/>
                 <w:szCs w:val="17"/>
               </w:rPr>
-              <w:t xml:space="preserve">Decision recorded</w:t>
+              <w:t xml:space="preserve">Notes given to product</w:t>
             </w:r>
           </w:p>
         </w:tc>
@@ -9946,7 +9973,7 @@
                 <w:sz w:val="17"/>
                 <w:szCs w:val="17"/>
               </w:rPr>
-              <w:t xml:space="preserve">NT2</w:t>
+              <w:t xml:space="preserve">NT3</w:t>
             </w:r>
           </w:p>
         </w:tc>
@@ -9979,7 +10006,7 @@
                 <w:sz w:val="17"/>
                 <w:szCs w:val="17"/>
               </w:rPr>
-              <w:t xml:space="preserve">Owner sessions on own domains: two or three owners who own a domain connect it to their page with only the in-app guide; note where each stops</w:t>
+              <w:t xml:space="preserve">Check the registrar steps on live screens at Whogohost, Qservers and DomainKing (menu names, box names, the save button) against what the app tells owners</w:t>
             </w:r>
           </w:p>
         </w:tc>
@@ -10012,7 +10039,7 @@
                 <w:sz w:val="17"/>
                 <w:szCs w:val="17"/>
               </w:rPr>
-              <w:t xml:space="preserve">Product lead, beta businesses</w:t>
+              <w:t xml:space="preserve">Anyone with an account at each</w:t>
             </w:r>
           </w:p>
         </w:tc>
@@ -10045,7 +10072,7 @@
                 <w:sz w:val="17"/>
                 <w:szCs w:val="17"/>
               </w:rPr>
-              <w:t xml:space="preserve">Notes given to product</w:t>
+              <w:t xml:space="preserve">Differences reported to engineering</w:t>
             </w:r>
           </w:p>
         </w:tc>
@@ -10116,7 +10143,7 @@
                 <w:sz w:val="17"/>
                 <w:szCs w:val="17"/>
               </w:rPr>
-              <w:t xml:space="preserve">NT3</w:t>
+              <w:t xml:space="preserve">NT5</w:t>
             </w:r>
           </w:p>
         </w:tc>
@@ -10149,7 +10176,7 @@
                 <w:sz w:val="17"/>
                 <w:szCs w:val="17"/>
               </w:rPr>
-              <w:t xml:space="preserve">Check the registrar steps on live screens at Whogohost, Qservers and DomainKing (menu names, box names, the save button) against what the app tells owners</w:t>
+              <w:t xml:space="preserve">Contract with the domain platform for buying and registering domains inside the app</w:t>
             </w:r>
           </w:p>
         </w:tc>
@@ -10182,7 +10209,7 @@
                 <w:sz w:val="17"/>
                 <w:szCs w:val="17"/>
               </w:rPr>
-              <w:t xml:space="preserve">Anyone with an account at each</w:t>
+              <w:t xml:space="preserve">Founder, lawyer</w:t>
             </w:r>
           </w:p>
         </w:tc>
@@ -10215,7 +10242,7 @@
                 <w:sz w:val="17"/>
                 <w:szCs w:val="17"/>
               </w:rPr>
-              <w:t xml:space="preserve">Differences reported to engineering</w:t>
+              <w:t xml:space="preserve">Contract signed</w:t>
             </w:r>
           </w:p>
         </w:tc>
@@ -10248,7 +10275,7 @@
                 <w:sz w:val="17"/>
                 <w:szCs w:val="17"/>
               </w:rPr>
-              <w:t xml:space="preserve">18 Dec</w:t>
+              <w:t xml:space="preserve">Draft by 31 Dec</w:t>
             </w:r>
           </w:p>
         </w:tc>
@@ -10286,7 +10313,7 @@
                 <w:sz w:val="17"/>
                 <w:szCs w:val="17"/>
               </w:rPr>
-              <w:t xml:space="preserve">NT5</w:t>
+              <w:t xml:space="preserve">P4-X1</w:t>
             </w:r>
           </w:p>
         </w:tc>
@@ -10319,7 +10346,7 @@
                 <w:sz w:val="17"/>
                 <w:szCs w:val="17"/>
               </w:rPr>
-              <w:t xml:space="preserve">Contract with the domain platform for buying and registering domains inside the app</w:t>
+              <w:t xml:space="preserve">List who gets operator console accounts (reviewing pages, field agents, incidents) and who reviews published connectors</w:t>
             </w:r>
           </w:p>
         </w:tc>
@@ -10352,7 +10379,7 @@
                 <w:sz w:val="17"/>
                 <w:szCs w:val="17"/>
               </w:rPr>
-              <w:t xml:space="preserve">Founder, lawyer</w:t>
+              <w:t xml:space="preserve">Founder, engineering lead</w:t>
             </w:r>
           </w:p>
         </w:tc>
@@ -10385,7 +10412,7 @@
                 <w:sz w:val="17"/>
                 <w:szCs w:val="17"/>
               </w:rPr>
-              <w:t xml:space="preserve">Contract signed</w:t>
+              <w:t xml:space="preserve">List agreed</w:t>
             </w:r>
           </w:p>
         </w:tc>
@@ -10418,7 +10445,7 @@
                 <w:sz w:val="17"/>
                 <w:szCs w:val="17"/>
               </w:rPr>
-              <w:t xml:space="preserve">Draft by 31 Dec</w:t>
+              <w:t xml:space="preserve">11 Dec</w:t>
             </w:r>
           </w:p>
         </w:tc>
@@ -10456,7 +10483,7 @@
                 <w:sz w:val="17"/>
                 <w:szCs w:val="17"/>
               </w:rPr>
-              <w:t xml:space="preserve">P4-X1</w:t>
+              <w:t xml:space="preserve">W4</w:t>
             </w:r>
           </w:p>
         </w:tc>
@@ -10489,7 +10516,7 @@
                 <w:sz w:val="17"/>
                 <w:szCs w:val="17"/>
               </w:rPr>
-              <w:t xml:space="preserve">List who gets operator console accounts (reviewing pages, field agents, incidents) and who reviews published connectors</w:t>
+              <w:t xml:space="preserve">USSD: an aggregator account (Africa's Talking or another) with a shortcode and sandbox credentials, and their answers on how callbacks arrive</w:t>
             </w:r>
           </w:p>
         </w:tc>
@@ -10522,7 +10549,7 @@
                 <w:sz w:val="17"/>
                 <w:szCs w:val="17"/>
               </w:rPr>
-              <w:t xml:space="preserve">Founder, engineering lead</w:t>
+              <w:t xml:space="preserve">Engineering lead</w:t>
             </w:r>
           </w:p>
         </w:tc>
@@ -10555,7 +10582,7 @@
                 <w:sz w:val="17"/>
                 <w:szCs w:val="17"/>
               </w:rPr>
-              <w:t xml:space="preserve">List agreed</w:t>
+              <w:t xml:space="preserve">Sandbox ready</w:t>
             </w:r>
           </w:p>
         </w:tc>
@@ -10588,7 +10615,7 @@
                 <w:sz w:val="17"/>
                 <w:szCs w:val="17"/>
               </w:rPr>
-              <w:t xml:space="preserve">11 Dec</w:t>
+              <w:t xml:space="preserve">31 Dec</w:t>
             </w:r>
           </w:p>
         </w:tc>
@@ -10626,7 +10653,7 @@
                 <w:sz w:val="17"/>
                 <w:szCs w:val="17"/>
               </w:rPr>
-              <w:t xml:space="preserve">W4</w:t>
+              <w:t xml:space="preserve">L5</w:t>
             </w:r>
           </w:p>
         </w:tc>
@@ -10659,7 +10686,7 @@
                 <w:sz w:val="17"/>
                 <w:szCs w:val="17"/>
               </w:rPr>
-              <w:t xml:space="preserve">USSD: an aggregator account (Africa's Talking or another) with a shortcode and sandbox credentials, and their answers on how callbacks arrive</w:t>
+              <w:t xml:space="preserve">Speech-to-text provider for voice notes, with a data-processing agreement covering Nigerian voice recordings (no training on the audio; retention; transfer out of Nigeria)</w:t>
             </w:r>
           </w:p>
         </w:tc>
@@ -10692,7 +10719,7 @@
                 <w:sz w:val="17"/>
                 <w:szCs w:val="17"/>
               </w:rPr>
-              <w:t xml:space="preserve">Engineering lead</w:t>
+              <w:t xml:space="preserve">Lawyer, product lead</w:t>
             </w:r>
           </w:p>
         </w:tc>
@@ -10725,7 +10752,7 @@
                 <w:sz w:val="17"/>
                 <w:szCs w:val="17"/>
               </w:rPr>
-              <w:t xml:space="preserve">Sandbox ready</w:t>
+              <w:t xml:space="preserve">Provider chosen; terms accepted</w:t>
             </w:r>
           </w:p>
         </w:tc>
@@ -10796,7 +10823,7 @@
                 <w:sz w:val="17"/>
                 <w:szCs w:val="17"/>
               </w:rPr>
-              <w:t xml:space="preserve">L5</w:t>
+              <w:t xml:space="preserve">P7</w:t>
             </w:r>
           </w:p>
         </w:tc>
@@ -10829,7 +10856,7 @@
                 <w:sz w:val="17"/>
                 <w:szCs w:val="17"/>
               </w:rPr>
-              <w:t xml:space="preserve">Speech-to-text provider for voice notes, with a data-processing agreement covering Nigerian voice recordings (no training on the audio; retention; transfer out of Nigeria)</w:t>
+              <w:t xml:space="preserve">Partner agreements for connectors that need one before their sandbox opens (for example NIBSS through a licensed partner)</w:t>
             </w:r>
           </w:p>
         </w:tc>
@@ -10862,7 +10889,7 @@
                 <w:sz w:val="17"/>
                 <w:szCs w:val="17"/>
               </w:rPr>
-              <w:t xml:space="preserve">Lawyer, product lead</w:t>
+              <w:t xml:space="preserve">Engineering lead</w:t>
             </w:r>
           </w:p>
         </w:tc>
@@ -10895,7 +10922,7 @@
                 <w:sz w:val="17"/>
                 <w:szCs w:val="17"/>
               </w:rPr>
-              <w:t xml:space="preserve">Provider chosen; terms accepted</w:t>
+              <w:t xml:space="preserve">List of which are needed, and first conversations</w:t>
             </w:r>
           </w:p>
         </w:tc>
@@ -10966,7 +10993,7 @@
                 <w:sz w:val="17"/>
                 <w:szCs w:val="17"/>
               </w:rPr>
-              <w:t xml:space="preserve">P7</w:t>
+              <w:t xml:space="preserve">P2 to P6, P9 to P12</w:t>
             </w:r>
           </w:p>
         </w:tc>
@@ -10999,7 +11026,7 @@
                 <w:sz w:val="17"/>
                 <w:szCs w:val="17"/>
               </w:rPr>
-              <w:t xml:space="preserve">Partner agreements for connectors that need one before their sandbox opens (for example NIBSS through a licensed partner)</w:t>
+              <w:t xml:space="preserve">Ask each payment provider contact the open questions engineering lists in each integration guide (Breet, Anchor, Flutterwave, Lenco, Remita, Monnify, Interswitch, and about 100 smaller "to confirm" questions). Book a call with each; engineering joins</w:t>
             </w:r>
           </w:p>
         </w:tc>
@@ -11065,7 +11092,7 @@
                 <w:sz w:val="17"/>
                 <w:szCs w:val="17"/>
               </w:rPr>
-              <w:t xml:space="preserve">List of which are needed, and first conversations</w:t>
+              <w:t xml:space="preserve">Answers recorded in each guide</w:t>
             </w:r>
           </w:p>
         </w:tc>
@@ -11098,7 +11125,7 @@
                 <w:sz w:val="17"/>
                 <w:szCs w:val="17"/>
               </w:rPr>
-              <w:t xml:space="preserve">31 Dec</w:t>
+              <w:t xml:space="preserve">Calls booked by 31 Dec</w:t>
             </w:r>
           </w:p>
         </w:tc>
@@ -11136,7 +11163,7 @@
                 <w:sz w:val="17"/>
                 <w:szCs w:val="17"/>
               </w:rPr>
-              <w:t xml:space="preserve">P2 to P6, P9 to P12</w:t>
+              <w:t xml:space="preserve">D3, D4, D6, D7, D8</w:t>
             </w:r>
           </w:p>
         </w:tc>
@@ -11169,7 +11196,7 @@
                 <w:sz w:val="17"/>
                 <w:szCs w:val="17"/>
               </w:rPr>
-              <w:t xml:space="preserve">Ask each payment provider contact the open questions engineering lists in each integration guide (Breet, Anchor, Flutterwave, Lenco, Remita, Monnify, Interswitch, and about 100 smaller "to confirm" questions). Book a call with each; engineering joins</w:t>
+              <w:t xml:space="preserve">Taskiem's own use inside the group (iSpend): the iSpend owner confirms the wallet-credit-exception workflow; operations confirms the payout-failure alert; iswallet production credentials and webhooks; then four weeks running in production</w:t>
             </w:r>
           </w:p>
         </w:tc>
@@ -11202,7 +11229,7 @@
                 <w:sz w:val="17"/>
                 <w:szCs w:val="17"/>
               </w:rPr>
-              <w:t xml:space="preserve">Engineering lead</w:t>
+              <w:t xml:space="preserve">iSpend product owner, ops, engineering</w:t>
             </w:r>
           </w:p>
         </w:tc>
@@ -11235,7 +11262,7 @@
                 <w:sz w:val="17"/>
                 <w:szCs w:val="17"/>
               </w:rPr>
-              <w:t xml:space="preserve">Answers recorded in each guide</w:t>
+              <w:t xml:space="preserve">Four weeks running</w:t>
             </w:r>
           </w:p>
         </w:tc>
@@ -11249,176 +11276,6 @@
               <w:right w:val="single" w:color="D5DDD6" w:sz="4"/>
             </w:tcBorders>
             <w:shd w:fill="FFFFFF" w:color="auto" w:val="clear"/>
-            <w:tcMar>
-              <w:top w:type="dxa" w:w="60"/>
-              <w:left w:type="dxa" w:w="100"/>
-              <w:bottom w:type="dxa" w:w="60"/>
-              <w:right w:type="dxa" w:w="100"/>
-            </w:tcMar>
-            <w:vAlign w:val="top"/>
-          </w:tcPr>
-          <w:p>
-            <w:pPr>
-              <w:spacing w:after="20" w:line="252"/>
-            </w:pPr>
-            <w:r>
-              <w:rPr>
-                <w:rFonts w:ascii="Plus Jakarta Sans" w:cs="Plus Jakarta Sans" w:eastAsia="Plus Jakarta Sans" w:hAnsi="Plus Jakarta Sans"/>
-                <w:color w:val="1F2A26"/>
-                <w:sz w:val="17"/>
-                <w:szCs w:val="17"/>
-              </w:rPr>
-              <w:t xml:space="preserve">Calls booked by 31 Dec</w:t>
-            </w:r>
-          </w:p>
-        </w:tc>
-      </w:tr>
-      <w:tr>
-        <w:trPr>
-          <w:cantSplit/>
-        </w:trPr>
-        <w:tc>
-          <w:tcPr>
-            <w:tcW w:type="dxa" w:w="885"/>
-            <w:tcBorders>
-              <w:top w:val="single" w:color="D5DDD6" w:sz="4"/>
-              <w:left w:val="single" w:color="D5DDD6" w:sz="4"/>
-              <w:bottom w:val="single" w:color="D5DDD6" w:sz="4"/>
-              <w:right w:val="single" w:color="D5DDD6" w:sz="4"/>
-            </w:tcBorders>
-            <w:shd w:fill="F1F4EF" w:color="auto" w:val="clear"/>
-            <w:tcMar>
-              <w:top w:type="dxa" w:w="60"/>
-              <w:left w:type="dxa" w:w="100"/>
-              <w:bottom w:type="dxa" w:w="60"/>
-              <w:right w:type="dxa" w:w="100"/>
-            </w:tcMar>
-            <w:vAlign w:val="top"/>
-          </w:tcPr>
-          <w:p>
-            <w:pPr>
-              <w:spacing w:after="20" w:line="252"/>
-            </w:pPr>
-            <w:r>
-              <w:rPr>
-                <w:rFonts w:ascii="Plus Jakarta Sans" w:cs="Plus Jakarta Sans" w:eastAsia="Plus Jakarta Sans" w:hAnsi="Plus Jakarta Sans"/>
-                <w:color w:val="1F2A26"/>
-                <w:sz w:val="17"/>
-                <w:szCs w:val="17"/>
-              </w:rPr>
-              <w:t xml:space="preserve">D3, D4, D6, D7, D8</w:t>
-            </w:r>
-          </w:p>
-        </w:tc>
-        <w:tc>
-          <w:tcPr>
-            <w:tcW w:type="dxa" w:w="4130"/>
-            <w:tcBorders>
-              <w:top w:val="single" w:color="D5DDD6" w:sz="4"/>
-              <w:left w:val="single" w:color="D5DDD6" w:sz="4"/>
-              <w:bottom w:val="single" w:color="D5DDD6" w:sz="4"/>
-              <w:right w:val="single" w:color="D5DDD6" w:sz="4"/>
-            </w:tcBorders>
-            <w:shd w:fill="F1F4EF" w:color="auto" w:val="clear"/>
-            <w:tcMar>
-              <w:top w:type="dxa" w:w="60"/>
-              <w:left w:type="dxa" w:w="100"/>
-              <w:bottom w:type="dxa" w:w="60"/>
-              <w:right w:type="dxa" w:w="100"/>
-            </w:tcMar>
-            <w:vAlign w:val="top"/>
-          </w:tcPr>
-          <w:p>
-            <w:pPr>
-              <w:spacing w:after="20" w:line="252"/>
-            </w:pPr>
-            <w:r>
-              <w:rPr>
-                <w:rFonts w:ascii="Plus Jakarta Sans" w:cs="Plus Jakarta Sans" w:eastAsia="Plus Jakarta Sans" w:hAnsi="Plus Jakarta Sans"/>
-                <w:color w:val="1F2A26"/>
-                <w:sz w:val="17"/>
-                <w:szCs w:val="17"/>
-              </w:rPr>
-              <w:t xml:space="preserve">Taskiem's own use inside the group (iSpend): the iSpend owner confirms the wallet-credit-exception workflow; operations confirms the payout-failure alert; iswallet production credentials and webhooks; then four weeks running in production</w:t>
-            </w:r>
-          </w:p>
-        </w:tc>
-        <w:tc>
-          <w:tcPr>
-            <w:tcW w:type="dxa" w:w="1475"/>
-            <w:tcBorders>
-              <w:top w:val="single" w:color="D5DDD6" w:sz="4"/>
-              <w:left w:val="single" w:color="D5DDD6" w:sz="4"/>
-              <w:bottom w:val="single" w:color="D5DDD6" w:sz="4"/>
-              <w:right w:val="single" w:color="D5DDD6" w:sz="4"/>
-            </w:tcBorders>
-            <w:shd w:fill="F1F4EF" w:color="auto" w:val="clear"/>
-            <w:tcMar>
-              <w:top w:type="dxa" w:w="60"/>
-              <w:left w:type="dxa" w:w="100"/>
-              <w:bottom w:type="dxa" w:w="60"/>
-              <w:right w:type="dxa" w:w="100"/>
-            </w:tcMar>
-            <w:vAlign w:val="top"/>
-          </w:tcPr>
-          <w:p>
-            <w:pPr>
-              <w:spacing w:after="20" w:line="252"/>
-            </w:pPr>
-            <w:r>
-              <w:rPr>
-                <w:rFonts w:ascii="Plus Jakarta Sans" w:cs="Plus Jakarta Sans" w:eastAsia="Plus Jakarta Sans" w:hAnsi="Plus Jakarta Sans"/>
-                <w:color w:val="1F2A26"/>
-                <w:sz w:val="17"/>
-                <w:szCs w:val="17"/>
-              </w:rPr>
-              <w:t xml:space="preserve">iSpend product owner, ops, engineering</w:t>
-            </w:r>
-          </w:p>
-        </w:tc>
-        <w:tc>
-          <w:tcPr>
-            <w:tcW w:type="dxa" w:w="2163"/>
-            <w:tcBorders>
-              <w:top w:val="single" w:color="D5DDD6" w:sz="4"/>
-              <w:left w:val="single" w:color="D5DDD6" w:sz="4"/>
-              <w:bottom w:val="single" w:color="D5DDD6" w:sz="4"/>
-              <w:right w:val="single" w:color="D5DDD6" w:sz="4"/>
-            </w:tcBorders>
-            <w:shd w:fill="F1F4EF" w:color="auto" w:val="clear"/>
-            <w:tcMar>
-              <w:top w:type="dxa" w:w="60"/>
-              <w:left w:type="dxa" w:w="100"/>
-              <w:bottom w:type="dxa" w:w="60"/>
-              <w:right w:type="dxa" w:w="100"/>
-            </w:tcMar>
-            <w:vAlign w:val="top"/>
-          </w:tcPr>
-          <w:p>
-            <w:pPr>
-              <w:spacing w:after="20" w:line="252"/>
-            </w:pPr>
-            <w:r>
-              <w:rPr>
-                <w:rFonts w:ascii="Plus Jakarta Sans" w:cs="Plus Jakarta Sans" w:eastAsia="Plus Jakarta Sans" w:hAnsi="Plus Jakarta Sans"/>
-                <w:color w:val="1F2A26"/>
-                <w:sz w:val="17"/>
-                <w:szCs w:val="17"/>
-              </w:rPr>
-              <w:t xml:space="preserve">Four weeks running</w:t>
-            </w:r>
-          </w:p>
-        </w:tc>
-        <w:tc>
-          <w:tcPr>
-            <w:tcW w:type="dxa" w:w="985"/>
-            <w:tcBorders>
-              <w:top w:val="single" w:color="D5DDD6" w:sz="4"/>
-              <w:left w:val="single" w:color="D5DDD6" w:sz="4"/>
-              <w:bottom w:val="single" w:color="D5DDD6" w:sz="4"/>
-              <w:right w:val="single" w:color="D5DDD6" w:sz="4"/>
-            </w:tcBorders>
-            <w:shd w:fill="F1F4EF" w:color="auto" w:val="clear"/>
             <w:tcMar>
               <w:top w:type="dxa" w:w="60"/>
               <w:left w:type="dxa" w:w="100"/>
@@ -13360,7 +13217,7 @@
                 <w:sz w:val="17"/>
                 <w:szCs w:val="17"/>
               </w:rPr>
-              <w:t xml:space="preserve">W3</w:t>
+              <w:t xml:space="preserve">P4-X1</w:t>
             </w:r>
           </w:p>
         </w:tc>
@@ -13393,7 +13250,7 @@
                 <w:sz w:val="17"/>
                 <w:szCs w:val="17"/>
               </w:rPr>
-              <w:t xml:space="preserve">Become a Meta Business Solution Provider, or partner with one</w:t>
+              <w:t xml:space="preserve">Who gets operator console accounts</w:t>
             </w:r>
           </w:p>
         </w:tc>
@@ -13426,7 +13283,7 @@
                 <w:sz w:val="17"/>
                 <w:szCs w:val="17"/>
               </w:rPr>
-              <w:t xml:space="preserve">18 Dec</w:t>
+              <w:t xml:space="preserve">11 Dec</w:t>
             </w:r>
           </w:p>
         </w:tc>
@@ -13464,7 +13321,7 @@
                 <w:sz w:val="17"/>
                 <w:szCs w:val="17"/>
               </w:rPr>
-              <w:t xml:space="preserve">P4-X1</w:t>
+              <w:t xml:space="preserve">E4</w:t>
             </w:r>
           </w:p>
         </w:tc>
@@ -13497,7 +13354,7 @@
                 <w:sz w:val="17"/>
                 <w:szCs w:val="17"/>
               </w:rPr>
-              <w:t xml:space="preserve">Who gets operator console accounts</w:t>
+              <w:t xml:space="preserve">Record the decision on the clean-room MySQL client (engineering drafts it; the founder approves)</w:t>
             </w:r>
           </w:p>
         </w:tc>
@@ -13511,110 +13368,6 @@
               <w:right w:val="single" w:color="D5DDD6" w:sz="4"/>
             </w:tcBorders>
             <w:shd w:fill="F1F4EF" w:color="auto" w:val="clear"/>
-            <w:tcMar>
-              <w:top w:type="dxa" w:w="60"/>
-              <w:left w:type="dxa" w:w="100"/>
-              <w:bottom w:type="dxa" w:w="60"/>
-              <w:right w:type="dxa" w:w="100"/>
-            </w:tcMar>
-            <w:vAlign w:val="top"/>
-          </w:tcPr>
-          <w:p>
-            <w:pPr>
-              <w:spacing w:after="20" w:line="252"/>
-            </w:pPr>
-            <w:r>
-              <w:rPr>
-                <w:rFonts w:ascii="Plus Jakarta Sans" w:cs="Plus Jakarta Sans" w:eastAsia="Plus Jakarta Sans" w:hAnsi="Plus Jakarta Sans"/>
-                <w:color w:val="1F2A26"/>
-                <w:sz w:val="17"/>
-                <w:szCs w:val="17"/>
-              </w:rPr>
-              <w:t xml:space="preserve">11 Dec</w:t>
-            </w:r>
-          </w:p>
-        </w:tc>
-      </w:tr>
-      <w:tr>
-        <w:trPr>
-          <w:cantSplit/>
-        </w:trPr>
-        <w:tc>
-          <w:tcPr>
-            <w:tcW w:type="dxa" w:w="1285"/>
-            <w:tcBorders>
-              <w:top w:val="single" w:color="D5DDD6" w:sz="4"/>
-              <w:left w:val="single" w:color="D5DDD6" w:sz="4"/>
-              <w:bottom w:val="single" w:color="D5DDD6" w:sz="4"/>
-              <w:right w:val="single" w:color="D5DDD6" w:sz="4"/>
-            </w:tcBorders>
-            <w:shd w:fill="FFFFFF" w:color="auto" w:val="clear"/>
-            <w:tcMar>
-              <w:top w:type="dxa" w:w="60"/>
-              <w:left w:type="dxa" w:w="100"/>
-              <w:bottom w:type="dxa" w:w="60"/>
-              <w:right w:type="dxa" w:w="100"/>
-            </w:tcMar>
-            <w:vAlign w:val="top"/>
-          </w:tcPr>
-          <w:p>
-            <w:pPr>
-              <w:spacing w:after="20" w:line="252"/>
-            </w:pPr>
-            <w:r>
-              <w:rPr>
-                <w:rFonts w:ascii="Plus Jakarta Sans" w:cs="Plus Jakarta Sans" w:eastAsia="Plus Jakarta Sans" w:hAnsi="Plus Jakarta Sans"/>
-                <w:color w:val="1F2A26"/>
-                <w:sz w:val="17"/>
-                <w:szCs w:val="17"/>
-              </w:rPr>
-              <w:t xml:space="preserve">E4</w:t>
-            </w:r>
-          </w:p>
-        </w:tc>
-        <w:tc>
-          <w:tcPr>
-            <w:tcW w:type="dxa" w:w="6639"/>
-            <w:tcBorders>
-              <w:top w:val="single" w:color="D5DDD6" w:sz="4"/>
-              <w:left w:val="single" w:color="D5DDD6" w:sz="4"/>
-              <w:bottom w:val="single" w:color="D5DDD6" w:sz="4"/>
-              <w:right w:val="single" w:color="D5DDD6" w:sz="4"/>
-            </w:tcBorders>
-            <w:shd w:fill="FFFFFF" w:color="auto" w:val="clear"/>
-            <w:tcMar>
-              <w:top w:type="dxa" w:w="60"/>
-              <w:left w:type="dxa" w:w="100"/>
-              <w:bottom w:type="dxa" w:w="60"/>
-              <w:right w:type="dxa" w:w="100"/>
-            </w:tcMar>
-            <w:vAlign w:val="top"/>
-          </w:tcPr>
-          <w:p>
-            <w:pPr>
-              <w:spacing w:after="20" w:line="252"/>
-            </w:pPr>
-            <w:r>
-              <w:rPr>
-                <w:rFonts w:ascii="Plus Jakarta Sans" w:cs="Plus Jakarta Sans" w:eastAsia="Plus Jakarta Sans" w:hAnsi="Plus Jakarta Sans"/>
-                <w:color w:val="1F2A26"/>
-                <w:sz w:val="17"/>
-                <w:szCs w:val="17"/>
-              </w:rPr>
-              <w:t xml:space="preserve">Record the decision on the clean-room MySQL client (engineering drafts it; the founder approves)</w:t>
-            </w:r>
-          </w:p>
-        </w:tc>
-        <w:tc>
-          <w:tcPr>
-            <w:tcW w:type="dxa" w:w="1714"/>
-            <w:tcBorders>
-              <w:top w:val="single" w:color="D5DDD6" w:sz="4"/>
-              <w:left w:val="single" w:color="D5DDD6" w:sz="4"/>
-              <w:bottom w:val="single" w:color="D5DDD6" w:sz="4"/>
-              <w:right w:val="single" w:color="D5DDD6" w:sz="4"/>
-            </w:tcBorders>
-            <w:shd w:fill="FFFFFF" w:color="auto" w:val="clear"/>
             <w:tcMar>
               <w:top w:type="dxa" w:w="60"/>
               <w:left w:type="dxa" w:w="100"/>

</xml_diff>